<commit_message>
Actas de Sprint Review y Retrospective S0-S2: firmas del equipo
- Se agrega el nombre de cada integrante como firma en las 5 actas existentes (Review S0 y S1, Retrospective S0, S1 y S2)
- Acta de Sprint Retrospective S1: se corrigen los roles de las firmas (Felipe Gutiérrez Scrum Master; Esteban Morales y Christian Cuadra Developer)
</commit_message>
<xml_diff>
--- a/Fase 2/Evidencias Proyecto/Evidencias de documentación/Sprint 0/Acta-Sprint-Retrospective-S0.docx
+++ b/Fase 2/Evidencias Proyecto/Evidencias de documentación/Sprint 0/Acta-Sprint-Retrospective-S0.docx
@@ -1114,7 +1114,13 @@
               <w:jc w:val="center"/>
             </w:pPr>
             <w:r>
-              <w:t xml:space="preserve">______________________________</w:t>
+              <w:rPr>
+                <w:rFonts w:ascii="Segoe Script" w:hAnsi="Segoe Script" w:eastAsia="Segoe Script"/>
+                <w:i/>
+                <w:color w:val="1F3A6B"/>
+                <w:sz w:val="26"/>
+              </w:rPr>
+              <w:t>Felipe Gutiérrez</w:t>
             </w:r>
           </w:p>
           <w:p>
@@ -1123,10 +1129,9 @@
             </w:pPr>
             <w:r>
               <w:rPr>
-                <w:b/>
-                <w:bCs/>
-              </w:rPr>
-              <w:t xml:space="preserve">Felipe Gutiérrez</w:t>
+                <w:rFonts w:ascii="Arial" w:hAnsi="Arial" w:eastAsia="Arial"/>
+              </w:rPr>
+              <w:t>______________________</w:t>
             </w:r>
           </w:p>
           <w:p>
@@ -1135,9 +1140,21 @@
             </w:pPr>
             <w:r>
               <w:rPr>
-                <w:color w:val="595959"/>
-              </w:rPr>
-              <w:t xml:space="preserve">Scrum Master</w:t>
+                <w:rFonts w:ascii="Arial" w:hAnsi="Arial" w:eastAsia="Arial"/>
+                <w:b/>
+              </w:rPr>
+              <w:t>Felipe Gutiérrez</w:t>
+            </w:r>
+          </w:p>
+          <w:p>
+            <w:pPr>
+              <w:jc w:val="center"/>
+            </w:pPr>
+            <w:r>
+              <w:rPr>
+                <w:rFonts w:ascii="Arial" w:hAnsi="Arial" w:eastAsia="Arial"/>
+              </w:rPr>
+              <w:t>Scrum Master</w:t>
             </w:r>
           </w:p>
         </w:tc>
@@ -1157,7 +1174,13 @@
               <w:jc w:val="center"/>
             </w:pPr>
             <w:r>
-              <w:t xml:space="preserve">______________________________</w:t>
+              <w:rPr>
+                <w:rFonts w:ascii="Segoe Script" w:hAnsi="Segoe Script" w:eastAsia="Segoe Script"/>
+                <w:i/>
+                <w:color w:val="1F3A6B"/>
+                <w:sz w:val="26"/>
+              </w:rPr>
+              <w:t>Esteban Morales</w:t>
             </w:r>
           </w:p>
           <w:p>
@@ -1166,10 +1189,9 @@
             </w:pPr>
             <w:r>
               <w:rPr>
-                <w:b/>
-                <w:bCs/>
-              </w:rPr>
-              <w:t xml:space="preserve">Esteban Morales</w:t>
+                <w:rFonts w:ascii="Arial" w:hAnsi="Arial" w:eastAsia="Arial"/>
+              </w:rPr>
+              <w:t>______________________</w:t>
             </w:r>
           </w:p>
           <w:p>
@@ -1178,9 +1200,21 @@
             </w:pPr>
             <w:r>
               <w:rPr>
-                <w:color w:val="595959"/>
-              </w:rPr>
-              <w:t xml:space="preserve">Developer</w:t>
+                <w:rFonts w:ascii="Arial" w:hAnsi="Arial" w:eastAsia="Arial"/>
+                <w:b/>
+              </w:rPr>
+              <w:t>Esteban Morales</w:t>
+            </w:r>
+          </w:p>
+          <w:p>
+            <w:pPr>
+              <w:jc w:val="center"/>
+            </w:pPr>
+            <w:r>
+              <w:rPr>
+                <w:rFonts w:ascii="Arial" w:hAnsi="Arial" w:eastAsia="Arial"/>
+              </w:rPr>
+              <w:t>Developer</w:t>
             </w:r>
           </w:p>
         </w:tc>
@@ -1200,7 +1234,13 @@
               <w:jc w:val="center"/>
             </w:pPr>
             <w:r>
-              <w:t xml:space="preserve">______________________________</w:t>
+              <w:rPr>
+                <w:rFonts w:ascii="Segoe Script" w:hAnsi="Segoe Script" w:eastAsia="Segoe Script"/>
+                <w:i/>
+                <w:color w:val="1F3A6B"/>
+                <w:sz w:val="26"/>
+              </w:rPr>
+              <w:t>Christian Cuadra</w:t>
             </w:r>
           </w:p>
           <w:p>
@@ -1209,10 +1249,9 @@
             </w:pPr>
             <w:r>
               <w:rPr>
-                <w:b/>
-                <w:bCs/>
-              </w:rPr>
-              <w:t xml:space="preserve">Christian Cuadra</w:t>
+                <w:rFonts w:ascii="Arial" w:hAnsi="Arial" w:eastAsia="Arial"/>
+              </w:rPr>
+              <w:t>______________________</w:t>
             </w:r>
           </w:p>
           <w:p>
@@ -1221,9 +1260,21 @@
             </w:pPr>
             <w:r>
               <w:rPr>
-                <w:color w:val="595959"/>
-              </w:rPr>
-              <w:t xml:space="preserve">Developer</w:t>
+                <w:rFonts w:ascii="Arial" w:hAnsi="Arial" w:eastAsia="Arial"/>
+                <w:b/>
+              </w:rPr>
+              <w:t>Christian Cuadra</w:t>
+            </w:r>
+          </w:p>
+          <w:p>
+            <w:pPr>
+              <w:jc w:val="center"/>
+            </w:pPr>
+            <w:r>
+              <w:rPr>
+                <w:rFonts w:ascii="Arial" w:hAnsi="Arial" w:eastAsia="Arial"/>
+              </w:rPr>
+              <w:t>Developer</w:t>
             </w:r>
           </w:p>
         </w:tc>

</xml_diff>

<commit_message>
Actas: el bloque de firmas no se separa entre páginas
</commit_message>
<xml_diff>
--- a/Fase 2/Evidencias Proyecto/Evidencias de documentación/Sprint 0/Acta-Sprint-Retrospective-S0.docx
+++ b/Fase 2/Evidencias Proyecto/Evidencias de documentación/Sprint 0/Acta-Sprint-Retrospective-S0.docx
@@ -1077,6 +1077,7 @@
     </w:p>
     <w:p>
       <w:pPr>
+        <w:keepNext/>
         <w:spacing w:after="120"/>
       </w:pPr>
     </w:p>
@@ -1098,6 +1099,9 @@
         <w:gridCol w:w="3010"/>
       </w:tblGrid>
       <w:tr>
+        <w:trPr>
+          <w:cantSplit/>
+        </w:trPr>
         <w:tc>
           <w:tcPr>
             <w:tcW w:type="dxa" w:w="3008"/>
@@ -1110,7 +1114,9 @@
           </w:tcPr>
           <w:p>
             <w:pPr>
-              <w:spacing w:before="600"/>
+              <w:keepNext/>
+              <w:keepLines/>
+              <w:spacing w:before="360"/>
               <w:jc w:val="center"/>
             </w:pPr>
             <w:r>
@@ -1125,6 +1131,8 @@
           </w:p>
           <w:p>
             <w:pPr>
+              <w:keepNext/>
+              <w:keepLines/>
               <w:jc w:val="center"/>
             </w:pPr>
             <w:r>
@@ -1136,6 +1144,8 @@
           </w:p>
           <w:p>
             <w:pPr>
+              <w:keepNext/>
+              <w:keepLines/>
               <w:jc w:val="center"/>
             </w:pPr>
             <w:r>
@@ -1148,6 +1158,7 @@
           </w:p>
           <w:p>
             <w:pPr>
+              <w:keepLines/>
               <w:jc w:val="center"/>
             </w:pPr>
             <w:r>
@@ -1170,7 +1181,9 @@
           </w:tcPr>
           <w:p>
             <w:pPr>
-              <w:spacing w:before="600"/>
+              <w:keepNext/>
+              <w:keepLines/>
+              <w:spacing w:before="360"/>
               <w:jc w:val="center"/>
             </w:pPr>
             <w:r>
@@ -1185,6 +1198,8 @@
           </w:p>
           <w:p>
             <w:pPr>
+              <w:keepNext/>
+              <w:keepLines/>
               <w:jc w:val="center"/>
             </w:pPr>
             <w:r>
@@ -1196,6 +1211,8 @@
           </w:p>
           <w:p>
             <w:pPr>
+              <w:keepNext/>
+              <w:keepLines/>
               <w:jc w:val="center"/>
             </w:pPr>
             <w:r>
@@ -1208,6 +1225,7 @@
           </w:p>
           <w:p>
             <w:pPr>
+              <w:keepLines/>
               <w:jc w:val="center"/>
             </w:pPr>
             <w:r>
@@ -1230,7 +1248,9 @@
           </w:tcPr>
           <w:p>
             <w:pPr>
-              <w:spacing w:before="600"/>
+              <w:keepNext/>
+              <w:keepLines/>
+              <w:spacing w:before="360"/>
               <w:jc w:val="center"/>
             </w:pPr>
             <w:r>
@@ -1245,6 +1265,8 @@
           </w:p>
           <w:p>
             <w:pPr>
+              <w:keepNext/>
+              <w:keepLines/>
               <w:jc w:val="center"/>
             </w:pPr>
             <w:r>
@@ -1256,6 +1278,8 @@
           </w:p>
           <w:p>
             <w:pPr>
+              <w:keepNext/>
+              <w:keepLines/>
               <w:jc w:val="center"/>
             </w:pPr>
             <w:r>
@@ -1268,6 +1292,7 @@
           </w:p>
           <w:p>
             <w:pPr>
+              <w:keepLines/>
               <w:jc w:val="center"/>
             </w:pPr>
             <w:r>

</xml_diff>